<commit_message>
Add industry migration-effort evidence (two arXiv case reports) to IEEE Computer manuscript
Co-Authored-By: Claude Sonnet 5.5 <noreply@anthropic.com>
Claude-Session: https://claude.ai/code/session_013HycsBHnRQDCEHKmLM3Rd4
</commit_message>
<xml_diff>
--- a/llm_realoptions/IEEE_Computer_manuscript.docx
+++ b/llm_realoptions/IEEE_Computer_manuscript.docx
@@ -412,6 +412,59 @@
               <w:rPr>
                 <w:sz w:val="18"/>
               </w:rPr>
+              <w:t>Migration effort in two industry reports</w:t>
+            </w:r>
+          </w:p>
+        </w:tc>
+        <w:tc>
+          <w:tcPr>
+            <w:tcW w:type="dxa" w:w="4320"/>
+          </w:tcPr>
+          <w:p>
+            <w:pPr>
+              <w:spacing w:after="20" w:line="240" w:lineRule="auto"/>
+            </w:pPr>
+            <w:r/>
+            <w:r>
+              <w:rPr>
+                <w:sz w:val="18"/>
+              </w:rPr>
+              <w:t>First migration of a production search application took “a couple of months end-to-end”; a structured regression testbed reduced it to “a couple of weeks” (one case)⁹. Deprecation and migration cycle of “roughly every 12 months” in a question-answering system with 5.3M interactions per month in six regions¹⁰</w:t>
+            </w:r>
+          </w:p>
+        </w:tc>
+        <w:tc>
+          <w:tcPr>
+            <w:tcW w:type="dxa" w:w="2160"/>
+          </w:tcPr>
+          <w:p>
+            <w:pPr>
+              <w:spacing w:after="20" w:line="240" w:lineRule="auto"/>
+            </w:pPr>
+            <w:r/>
+            <w:r>
+              <w:rPr>
+                <w:sz w:val="18"/>
+              </w:rPr>
+              <w:t>Tripathi et al.; Casey et al. (arXiv)</w:t>
+            </w:r>
+          </w:p>
+        </w:tc>
+      </w:tr>
+      <w:tr>
+        <w:tc>
+          <w:tcPr>
+            <w:tcW w:type="dxa" w:w="2880"/>
+          </w:tcPr>
+          <w:p>
+            <w:pPr>
+              <w:spacing w:after="20" w:line="240" w:lineRule="auto"/>
+            </w:pPr>
+            <w:r/>
+            <w:r>
+              <w:rPr>
+                <w:sz w:val="18"/>
+              </w:rPr>
               <w:t>Labor cost</w:t>
             </w:r>
           </w:p>
@@ -472,6 +525,15 @@
           <w:i w:val="0"/>
         </w:rPr>
         <w:t>Three patterns matter. Lifetimes are short: the median retired model lived about 14 months, and the shortest, two Gemini live-audio models, lived 5.7 and 8.0 months. Notice is usually generous: the median is about six months and only 3 of 96 OpenAI records give less than 90 days. And replacements are not price-neutral. In the Gemini records, the named replacement of Gemini 2.0 Flash is priced at about 8.3 times its predecessor on a blended list price, and that of 2.0 Flash-Lite at about 4.1 times. Google also announced that Gemini 3.6 to 3.8 Flash list prices would rise on 1 January 2027, so prices can change within a version. These price ratios mix price and capability changes, so they are not like-for-like quotes, and we treat them as an upper bound on price risk. Behavior can also shift between versions of the same model,⁸ which adds testing effort to every migration.</w:t>
+      </w:r>
+    </w:p>
+    <w:p>
+      <w:r>
+        <w:rPr>
+          <w:b w:val="0"/>
+          <w:i w:val="0"/>
+        </w:rPr>
+        <w:t>Two industry reports give a first check on our effort assumptions. One describes a search application built on GPT-4-32k, which OpenAI deprecated on 6 June 2024 with shutdown a year later, and whose successor GPT-4.5-preview was deprecated on 14 April 2025 with shutdown on 14 July 2025, a window of three months;⁹ its first migration took a couple of months and a structured testbed later cut this to a couple of weeks. The other reports a deprecation and migration cycle of roughly 12 months in a commercial question-answering system and builds a statistical method to limit the cost of evaluating replacements.¹⁰ Both match the order of magnitude of our assumptions: migrations about once a year, effort of weeks rather than days, and a large reduction in effort once an evaluation harness exists (our base case halves the effort; the sensitivity analysis goes down to 0.3 of it). They are single cases that report elapsed time, not person-weeks, so they support the direction of the assumptions, not their values.</w:t>
       </w:r>
     </w:p>
     <w:p>
@@ -2132,7 +2194,7 @@
           <w:b w:val="0"/>
           <w:i w:val="0"/>
         </w:rPr>
-        <w:t>The public record is small: nine retired Gemini models, 96 OpenAI retirements, and six price ratios. Google provides no announcement dates, so notice is taken from another vendor. Migration effort, the premium, outage cost, token volume, and price correlation are assumptions that we vary rather than measure, and the savings are conditional on them. Only variable costs are counted. The simulation does not model quality differences between models, contract terms, or regulatory constraints on moving data between vendors. A field study of actual migrations, even a single firm's, would replace the largest assumptions. Records and prices were extracted automatically and should be verified before the numbers are quoted.</w:t>
+        <w:t>The public record is small: nine retired Gemini models, 96 OpenAI retirements, and six price ratios. Google provides no announcement dates, so notice is taken from another vendor. Migration effort, the premium, outage cost, token volume, and price correlation are assumptions that we vary rather than measure, and the savings are conditional on them. Only variable costs are counted. The simulation does not model quality differences between models, contract terms, or regulatory constraints on moving data between vendors. The two industry reports we cite describe single migrations in qualitative terms and give no person-weeks, so a field study of actual migrations, even a single firm's, would replace the largest assumptions. Records and prices were extracted automatically and should be verified before the numbers are quoted.</w:t>
       </w:r>
     </w:p>
     <w:p>
@@ -2280,6 +2342,34 @@
           <w:sz w:val="18"/>
         </w:rPr>
         <w:t>[8] L. Chen, M. Zaharia, and J. Zou, “How is ChatGPT’s behavior changing over time?” arXiv:2307.09009, 2023.</w:t>
+      </w:r>
+    </w:p>
+    <w:p>
+      <w:pPr>
+        <w:spacing w:after="40"/>
+        <w:ind w:left="432" w:hanging="432"/>
+      </w:pPr>
+      <w:r>
+        <w:rPr>
+          <w:b w:val="0"/>
+          <w:i w:val="0"/>
+          <w:sz w:val="18"/>
+        </w:rPr>
+        <w:t>[9] S. Tripathi, P. Nema, A. Halder, S. Qiao, and A. Jindal, “Prompt migration: Stabilizing GenAI applications with evolving large language models,” arXiv:2507.05573, 2025.</w:t>
+      </w:r>
+    </w:p>
+    <w:p>
+      <w:pPr>
+        <w:spacing w:after="40"/>
+        <w:ind w:left="432" w:hanging="432"/>
+      </w:pPr>
+      <w:r>
+        <w:rPr>
+          <w:b w:val="0"/>
+          <w:i w:val="0"/>
+          <w:sz w:val="18"/>
+        </w:rPr>
+        <w:t>[10] E. Casey, D. Roberts, D. Sim, and I. Beaver, “When your LLM reaches end-of-life: A framework for confident model migration in production systems,” arXiv:2604.27082, 2026.</w:t>
       </w:r>
     </w:p>
     <w:p>

</xml_diff>

<commit_message>
Corrected simulation results; IEEE Computer manuscript v2 with analytical results, corrected tables 2-4
Co-Authored-By: Claude Sonnet 5.5 <noreply@anthropic.com>
Claude-Session: https://claude.ai/code/session_013HycsBHnRQDCEHKmLM3Rd4
</commit_message>
<xml_diff>
--- a/llm_realoptions/IEEE_Computer_manuscript.docx
+++ b/llm_realoptions/IEEE_Computer_manuscript.docx
@@ -64,7 +64,7 @@
           <w:i w:val="0"/>
           <w:sz w:val="20"/>
         </w:rPr>
-        <w:t>—Cloud large language model (LLM) application programming interfaces (APIs) shorten the planning horizon of enterprise IT: model versions are retired about a year after release, and successors are repriced. Public records show a median lifetime of 13.8 months for retired Gemini API models (n = 9) and a median notice of 183 days for OpenAI retirements (n = 96). We treat maintenance as real options: choosing among vendors at retirement, and switching early. A 36-month simulation of an enterprise chatbot, with inputs taken from these records, shows that a flexible architecture lowers discounted lifecycle cost by 24% when successor prices are unchanged and by 3% to 77% when they change, depending on how closely vendors' prices move together. We report the break-even flexibility premium for each case. A volatility-based switching threshold did not beat a simple net-present-value rule.</w:t>
+        <w:t>—Cloud large language model (LLM) application programming interfaces (APIs) shorten the planning horizon of enterprise IT: model versions are retired about a year after release, and successors are repriced. Public records show a median lifetime of 13.8 months for retired Gemini API models (n = 9) and a median notice of 183 days for OpenAI retirements (n = 96). We treat maintenance as real options: choosing among vendors at retirement, and switching early. A 36-month simulation of an enterprise chatbot, with inputs taken from these records, shows that a flexible architecture lowers discounted lifecycle cost by 27% when successor prices are unchanged and by 3% to 67% when they change, depending on how closely vendors' prices move together. We report the break-even flexibility premium for each case. A switching threshold from option theory saved 0.4% to 1.5% of cost more than a simple net-present-value rule, a small gain beside the choice at retirement.</w:t>
       </w:r>
     </w:p>
     <w:p>
@@ -132,7 +132,7 @@
           <w:b w:val="0"/>
           <w:i w:val="0"/>
         </w:rPr>
-        <w:t>Two cautions shape the presentation. First, some inputs cannot be taken from public data, notably migration effort and the way competing vendors' prices move together. We therefore report break-even values rather than a single saving. Second, one result is negative: a switching threshold derived from option theory did not improve on a simple net-present-value (NPV) rule. We report it because it limits what the framework can claim.</w:t>
+        <w:t>Two cautions shape the presentation. First, some inputs cannot be taken from public data, notably migration effort and the way competing vendors' prices move together. We therefore report break-even values rather than a single saving. Second, the value of timing is small: a switching threshold derived from option theory improved on a simple net-present-value (NPV) rule by only 0.4% to 1.5% of cost. We report it because it limits what the timing option can claim.</w:t>
       </w:r>
     </w:p>
     <w:p>
@@ -599,7 +599,7 @@
           <w:b w:val="0"/>
           <w:i w:val="0"/>
         </w:rPr>
-        <w:t xml:space="preserve"> Between retirements a cheaper or better alternative may appear. Switching costs effort, so the firm waits until the present value of savings is high enough. Option theory gives a threshold: with a price gap that follows a random walk with volatility σ and a discount rate r, the firm should switch when the savings are θ times the switching cost, where θ = β/(β−1) and β is the positive root of ½σ²β(β−1) − r = 0 (a zero-drift form of the McDonald–Siegel result³). At 10% monthly volatility and a 10% annual discount rate, θ is 2.1.</w:t>
+        <w:t xml:space="preserve"> Between retirements a cheaper or better alternative may appear. Switching costs effort, so the firm waits until the present value of savings is high enough. Option theory gives a threshold: with a price gap that follows a random walk with volatility σ and a discount rate r, the firm should switch when the savings are θ times the switching cost, where θ = β/(β−1) and β is the positive root of ½σ²β(β−1) − r = 0 (a zero-drift form of the McDonald–Siegel result³). At 10% monthly volatility and a 10% annual discount rate, θ is 2.1. We use this one-shot form as the trigger in the simulation. When the alternative's price is an outside random level and each switch is costly, the exact optimum is a band: switch when the gap reaches b, where b exceeds the NPV break-even and widens with volatility and switching cost (see Analytical results).</w:t>
       </w:r>
     </w:p>
     <w:p>
@@ -622,6 +622,28 @@
           <w:i w:val="0"/>
         </w:rPr>
         <w:t xml:space="preserve"> The firm pays a premium up front (the abstraction layer and the harness) and in return lowers the effort of each later migration and gains the first two options. The premium is the price of the options, so the first question for a CIO is the premium at which flexibility stops paying.</w:t>
+      </w:r>
+    </w:p>
+    <w:p>
+      <w:pPr>
+        <w:keepNext/>
+        <w:spacing w:before="200"/>
+      </w:pPr>
+      <w:r>
+        <w:rPr>
+          <w:b/>
+          <w:sz w:val="22"/>
+        </w:rPr>
+        <w:t>ANALYTICAL RESULTS</w:t>
+      </w:r>
+    </w:p>
+    <w:p>
+      <w:r>
+        <w:rPr>
+          <w:b w:val="0"/>
+          <w:i w:val="0"/>
+        </w:rPr>
+        <w:t>Three results organize the simulation; derivations and numerical checks are in the project repository. First, with a premium P, migration effort K, effort factor φ and expected discounted number of migrations Λ, flexibility pays on effort alone when P &lt; (1 − φ)KΛ. The break-even grows with retirement frequency and horizon and does not depend on token volume. Second, when the replacement price multiples R1 and R2 of two vendors are identical copies with probability c and independent draws otherwise, choosing the cheaper vendor lowers the expected price multiple at each retirement by (1 − c)G/2, where G is the mean absolute difference between two independent draws (1.66 for the six observed ratios, against a mean of 2.48). The value of the choice is zero when vendors reprice together and rises with the dispersion of repricing. Third, if the cost gap between two vendors moves as a random walk and switching costs K, the optimal rule is a band that is wider than the NPV break-even rK/2 and widens with volatility and K, so that an NPV rule switches too often. The simulation reproduces the first two results exactly (a break-even of 10.1 person-weeks against 10.1 simulated for φ = 0.5, before the emergency surcharge and outage costs that raise it to 16.0 in Table 3) and the third in a separate check, where payoff peaks at the predicted band.</w:t>
       </w:r>
     </w:p>
     <w:p>
@@ -708,7 +730,7 @@
           <w:b w:val="0"/>
           <w:i w:val="0"/>
         </w:rPr>
-        <w:t xml:space="preserve"> switches early only when savings exceed θ times the switching cost. The alternative vendor's price ratio equals the successor's with probability c (the correlation parameter, base 0.5) and is otherwise an independent draw.</w:t>
+        <w:t xml:space="preserve"> switches early only when savings exceed θ times the switching cost. The alternative vendor's price ratio equals the successor's with probability c (the correlation parameter, base 0.5) and is otherwise an independent draw. Both vendors' price levels also follow monthly random walks with 10% volatility and innovation correlation c, and a retirement reprices both vendors.</w:t>
       </w:r>
     </w:p>
     <w:p>
@@ -879,7 +901,7 @@
               <w:rPr>
                 <w:sz w:val="18"/>
               </w:rPr>
-              <w:t>54.1 [49.9, 58.3]</w:t>
+              <w:t>50.1 [47.0, 53.2]</w:t>
             </w:r>
           </w:p>
         </w:tc>
@@ -896,7 +918,7 @@
               <w:rPr>
                 <w:sz w:val="18"/>
               </w:rPr>
-              <w:t>65.2</w:t>
+              <w:t>50.2</w:t>
             </w:r>
           </w:p>
         </w:tc>
@@ -913,7 +935,7 @@
               <w:rPr>
                 <w:sz w:val="18"/>
               </w:rPr>
-              <w:t>62.9</w:t>
+              <w:t>50.4</w:t>
             </w:r>
           </w:p>
         </w:tc>
@@ -949,7 +971,7 @@
               <w:rPr>
                 <w:sz w:val="18"/>
               </w:rPr>
-              <w:t>23.7 [23.2, 24.2]</w:t>
+              <w:t>27.1 [26.6, 27.6]</w:t>
             </w:r>
           </w:p>
         </w:tc>
@@ -966,7 +988,7 @@
               <w:rPr>
                 <w:sz w:val="18"/>
               </w:rPr>
-              <w:t>24.0</w:t>
+              <w:t>25.8</w:t>
             </w:r>
           </w:p>
         </w:tc>
@@ -983,7 +1005,7 @@
               <w:rPr>
                 <w:sz w:val="18"/>
               </w:rPr>
-              <w:t>23.8</w:t>
+              <w:t>26.9</w:t>
             </w:r>
           </w:p>
         </w:tc>
@@ -1019,7 +1041,7 @@
               <w:rPr>
                 <w:sz w:val="18"/>
               </w:rPr>
-              <w:t>3.3 [3.3, 3.4]</w:t>
+              <w:t>3.4 [3.4, 3.5]</w:t>
             </w:r>
           </w:p>
         </w:tc>
@@ -1036,7 +1058,7 @@
               <w:rPr>
                 <w:sz w:val="18"/>
               </w:rPr>
-              <w:t>32.4</w:t>
+              <w:t>3.4</w:t>
             </w:r>
           </w:p>
         </w:tc>
@@ -1053,7 +1075,7 @@
               <w:rPr>
                 <w:sz w:val="18"/>
               </w:rPr>
-              <w:t>27.9</w:t>
+              <w:t>3.4</w:t>
             </w:r>
           </w:p>
         </w:tc>
@@ -1089,7 +1111,7 @@
               <w:rPr>
                 <w:sz w:val="18"/>
               </w:rPr>
-              <w:t>77.4</w:t>
+              <w:t>67.2 [60.8, 73.7]</w:t>
             </w:r>
           </w:p>
         </w:tc>
@@ -1106,7 +1128,7 @@
               <w:rPr>
                 <w:sz w:val="18"/>
               </w:rPr>
-              <w:t>80.2</w:t>
+              <w:t>67.2</w:t>
             </w:r>
           </w:p>
         </w:tc>
@@ -1123,7 +1145,7 @@
               <w:rPr>
                 <w:sz w:val="18"/>
               </w:rPr>
-              <w:t>79.4</w:t>
+              <w:t>67.4</w:t>
             </w:r>
           </w:p>
         </w:tc>
@@ -1140,7 +1162,7 @@
           <w:b w:val="0"/>
           <w:i w:val="0"/>
         </w:rPr>
-        <w:t>Table 2 shows the central finding. When the successor is priced like its predecessor, a flexible architecture saves about 24% of variable lifecycle cost, entirely through lower migration effort net of the premium. When retirements come with price increases, as in the Gemini records, the saving depends on whether another vendor can be had at a different price. If vendors' prices rise together there is nothing to choose between and the saving falls to 3%; if they move independently the saving reaches 77%. The data used here cannot tell which case holds, so a CIO should estimate it first.</w:t>
+        <w:t>Table 2 shows the central finding. When the successor is priced like its predecessor, a flexible architecture saves about 27% of variable lifecycle cost, entirely through lower migration effort net of the premium. When retirements come with price increases, as in the Gemini records, the saving depends on whether another vendor can be had at a different price. If vendors' prices rise together there is nothing to choose between and the saving falls to 3%; if they move independently the saving reaches 67%. The data used here cannot tell which case holds, so a CIO should estimate it first.</w:t>
       </w:r>
     </w:p>
     <w:p>
@@ -1258,7 +1280,7 @@
               <w:rPr>
                 <w:sz w:val="18"/>
               </w:rPr>
-              <w:t>14.8 [14.5, 15.1]</w:t>
+              <w:t>16.0 [15.7, 16.3]</w:t>
             </w:r>
           </w:p>
         </w:tc>
@@ -1294,7 +1316,7 @@
               <w:rPr>
                 <w:sz w:val="18"/>
               </w:rPr>
-              <w:t>73.0 [71.5, 74.5]</w:t>
+              <w:t>73.4 [72.0, 74.9]</w:t>
             </w:r>
           </w:p>
         </w:tc>
@@ -1330,7 +1352,7 @@
               <w:rPr>
                 <w:sz w:val="18"/>
               </w:rPr>
-              <w:t>14.5 [14.2, 14.8]</w:t>
+              <w:t>15.1 [14.8, 15.3]</w:t>
             </w:r>
           </w:p>
         </w:tc>
@@ -1366,7 +1388,7 @@
               <w:rPr>
                 <w:sz w:val="18"/>
               </w:rPr>
-              <w:t>27.1 [25.6, 28.6]</w:t>
+              <w:t>26.3 [24.9, 27.7]</w:t>
             </w:r>
           </w:p>
         </w:tc>
@@ -1402,7 +1424,7 @@
               <w:rPr>
                 <w:sz w:val="18"/>
               </w:rPr>
-              <w:t>140.3 [125.8, 154.9]</w:t>
+              <w:t>129.5 [116.0, 143.1]</w:t>
             </w:r>
           </w:p>
         </w:tc>
@@ -1438,7 +1460,7 @@
               <w:rPr>
                 <w:sz w:val="18"/>
               </w:rPr>
-              <w:t>198.4 [181.2, 215.7]</w:t>
+              <w:t>195.3 [158.5, 232.1]</w:t>
             </w:r>
           </w:p>
         </w:tc>
@@ -1455,7 +1477,7 @@
           <w:b w:val="0"/>
           <w:i w:val="0"/>
         </w:rPr>
-        <w:t>Even where flexibility yields no price advantage, the break-even premium is about 15 person-weeks against a base premium of 6, because the simulated firm migrates 4.4 times in three years on average. The break-even grows with token volume and with the independence of vendors' prices, because the choice option then has more to save; at one billion tokens per month it exceeds one hundred person-weeks. These larger values rest on the empirical price ratios, which include capability changes, and should be read as an upper range. The low end, 15 weeks, uses no price shock at all. A firm whose premium for an abstraction layer and evaluation harness is below that low end can therefore justify it on migration effort alone, if retirement frequency is as high as in the public records.</w:t>
+        <w:t>Even where flexibility yields no price advantage, the break-even premium is about 15 to 16 person-weeks against a base premium of 6, because the simulated firm migrates 4.4 times in three years on average. The break-even grows with token volume and with the independence of vendors' prices, because the choice option then has more to save; at one billion tokens per month it exceeds one hundred person-weeks. These larger values rest on the empirical price ratios, which include capability changes, and should be read as an upper range. The low end, 15 to 16 weeks, uses no price shock or perfectly correlated prices. A firm whose premium for an abstraction layer and evaluation harness is below that low end can therefore justify it on migration effort alone, if retirement frequency is as high as in the public records.</w:t>
       </w:r>
     </w:p>
     <w:p>
@@ -1468,7 +1490,7 @@
           <w:b/>
           <w:i/>
         </w:rPr>
-        <w:t>The threshold rule did not beat the NPV rule</w:t>
+        <w:t>A switching threshold helps a little</w:t>
       </w:r>
     </w:p>
     <w:p>
@@ -1477,7 +1499,7 @@
           <w:b w:val="0"/>
           <w:i w:val="0"/>
         </w:rPr>
-        <w:t>A switching trigger derived from option theory was no better than a plain NPV check. Table 4 compares the two rules in the base case at several price-gap volatilities. The threshold rule had higher cost in all five rows, and the difference was statistically distinguishable from zero in four.</w:t>
+        <w:t>A switching trigger derived from option theory was slightly cheaper than a plain NPV check. Table 4 compares the two rules in the base case at several price-gap volatilities. The threshold rule had lower cost in all five rows, and the difference was statistically distinguishable from zero in four.</w:t>
       </w:r>
     </w:p>
     <w:p>
@@ -1489,7 +1511,7 @@
           <w:b/>
           <w:sz w:val="20"/>
         </w:rPr>
-        <w:t>Table 4. Present-value cost of switching rules (USD) and number of early switches per lifecycle (8,000 lifecycles). Difference = NPV rule cost minus threshold cost; a negative value means the NPV rule is cheaper.</w:t>
+        <w:t>Table 4. Present-value cost of switching rules (USD) and number of early switches per lifecycle (8,000 lifecycles). Difference = NPV rule cost minus threshold cost; a positive value means the threshold rule is cheaper.</w:t>
       </w:r>
     </w:p>
     <w:tbl>
@@ -1633,7 +1655,7 @@
               <w:rPr>
                 <w:sz w:val="18"/>
               </w:rPr>
-              <w:t>379,401</w:t>
+              <w:t>475,868</w:t>
             </w:r>
           </w:p>
         </w:tc>
@@ -1650,7 +1672,7 @@
               <w:rPr>
                 <w:sz w:val="18"/>
               </w:rPr>
-              <w:t>390,898</w:t>
+              <w:t>475,730</w:t>
             </w:r>
           </w:p>
         </w:tc>
@@ -1667,7 +1689,7 @@
               <w:rPr>
                 <w:sz w:val="18"/>
               </w:rPr>
-              <w:t>−11,498 [−29,711, 6,715]</w:t>
+              <w:t>137 [−208, 482]</w:t>
             </w:r>
           </w:p>
         </w:tc>
@@ -1684,7 +1706,7 @@
               <w:rPr>
                 <w:sz w:val="18"/>
               </w:rPr>
-              <w:t>1.0 / 0.7</w:t>
+              <w:t>0.2 / 0.1</w:t>
             </w:r>
           </w:p>
         </w:tc>
@@ -1720,7 +1742,7 @@
               <w:rPr>
                 <w:sz w:val="18"/>
               </w:rPr>
-              <w:t>327,059</w:t>
+              <w:t>453,911</w:t>
             </w:r>
           </w:p>
         </w:tc>
@@ -1737,7 +1759,7 @@
               <w:rPr>
                 <w:sz w:val="18"/>
               </w:rPr>
-              <w:t>352,640</w:t>
+              <w:t>452,220</w:t>
             </w:r>
           </w:p>
         </w:tc>
@@ -1754,7 +1776,7 @@
               <w:rPr>
                 <w:sz w:val="18"/>
               </w:rPr>
-              <w:t>−25,581 [−40,154, −11,009]</w:t>
+              <w:t>1,690 [227, 3,153]</w:t>
             </w:r>
           </w:p>
         </w:tc>
@@ -1771,7 +1793,7 @@
               <w:rPr>
                 <w:sz w:val="18"/>
               </w:rPr>
-              <w:t>1.7 / 0.8</w:t>
+              <w:t>0.5 / 0.2</w:t>
             </w:r>
           </w:p>
         </w:tc>
@@ -1807,7 +1829,7 @@
               <w:rPr>
                 <w:sz w:val="18"/>
               </w:rPr>
-              <w:t>251,262</w:t>
+              <w:t>389,947</w:t>
             </w:r>
           </w:p>
         </w:tc>
@@ -1824,7 +1846,7 @@
               <w:rPr>
                 <w:sz w:val="18"/>
               </w:rPr>
-              <w:t>309,605</w:t>
+              <w:t>386,600</w:t>
             </w:r>
           </w:p>
         </w:tc>
@@ -1841,7 +1863,7 @@
               <w:rPr>
                 <w:sz w:val="18"/>
               </w:rPr>
-              <w:t>−58,343 [−68,680, −48,005]</w:t>
+              <w:t>3,347 [1,602, 5,092]</w:t>
             </w:r>
           </w:p>
         </w:tc>
@@ -1858,7 +1880,7 @@
               <w:rPr>
                 <w:sz w:val="18"/>
               </w:rPr>
-              <w:t>2.5 / 0.7</w:t>
+              <w:t>0.9 / 0.2</w:t>
             </w:r>
           </w:p>
         </w:tc>
@@ -1894,7 +1916,7 @@
               <w:rPr>
                 <w:sz w:val="18"/>
               </w:rPr>
-              <w:t>187,709</w:t>
+              <w:t>262,146</w:t>
             </w:r>
           </w:p>
         </w:tc>
@@ -1911,7 +1933,7 @@
               <w:rPr>
                 <w:sz w:val="18"/>
               </w:rPr>
-              <w:t>291,481</w:t>
+              <w:t>258,257</w:t>
             </w:r>
           </w:p>
         </w:tc>
@@ -1928,7 +1950,7 @@
               <w:rPr>
                 <w:sz w:val="18"/>
               </w:rPr>
-              <w:t>−103,772 [−111,715, −95,829]</w:t>
+              <w:t>3,890 [1,908, 5,872]</w:t>
             </w:r>
           </w:p>
         </w:tc>
@@ -1945,7 +1967,7 @@
               <w:rPr>
                 <w:sz w:val="18"/>
               </w:rPr>
-              <w:t>2.7 / 0.4</w:t>
+              <w:t>1.2 / 0.2</w:t>
             </w:r>
           </w:p>
         </w:tc>
@@ -1981,7 +2003,7 @@
               <w:rPr>
                 <w:sz w:val="18"/>
               </w:rPr>
-              <w:t>102,484</w:t>
+              <w:t>99,457</w:t>
             </w:r>
           </w:p>
         </w:tc>
@@ -1998,7 +2020,7 @@
               <w:rPr>
                 <w:sz w:val="18"/>
               </w:rPr>
-              <w:t>102,703</w:t>
+              <w:t>97,985</w:t>
             </w:r>
           </w:p>
         </w:tc>
@@ -2015,7 +2037,7 @@
               <w:rPr>
                 <w:sz w:val="18"/>
               </w:rPr>
-              <w:t>−219 [−240, −199]</w:t>
+              <w:t>1,471 [1,401, 1,542]</w:t>
             </w:r>
           </w:p>
         </w:tc>
@@ -2032,7 +2054,7 @@
               <w:rPr>
                 <w:sz w:val="18"/>
               </w:rPr>
-              <w:t>0.3 / 0.0</w:t>
+              <w:t>0.3 / 0.1</w:t>
             </w:r>
           </w:p>
         </w:tc>
@@ -2049,7 +2071,7 @@
           <w:b w:val="0"/>
           <w:i w:val="0"/>
         </w:rPr>
-        <w:t>The reason lies in the price process. In our model the gap between the cheapest alternative and the current model has no drift, and it resets to zero after each switch, so favorable gaps keep recurring and a firm that switches often benefits. The threshold rule waits for larger savings and therefore switches less. Real markets include frictions that this process omits: alternatives differ in quality, so a lower price may not be a like-for-like gain, and re-evaluating a candidate costs effort. Until the price process is calibrated on like-for-like quotes, we do not claim that the threshold improves timing. We keep it in the framework as a hypothesis and recommend a plain NPV check with an explicit switching cost in practice.</w:t>
+        <w:t>The gain is between 0.4% and 1.5% of cost when volatility is at least 0.10. The NPV rule switches two to six times as often, and pays the switching cost for gaps that later reverse; the threshold waits for gaps that are likely to persist. Both rules add little to the choice made at retirement: in Table 2 early switching changes the saving by at most 1.3 percentage points. Retirements are frequent enough to supply most of the opportunities to change vendor at no extra cost. The result is conditional on a price process with no drift and equal volatility for both vendors, and on alternatives that are like-for-like in quality; if quality differences or re-evaluation costs are large, early switching is worth less still.</w:t>
       </w:r>
     </w:p>
     <w:p>
@@ -2128,7 +2150,7 @@
           <w:b w:val="0"/>
           <w:i w:val="0"/>
         </w:rPr>
-        <w:t xml:space="preserve"> Multiply the expected number of migrations by the effort a vendor-neutral layer would save, and compare it with the cost of building and maintaining the layer and the evaluation harness. In our simulation the break-even is about 15 person-weeks under the least favorable price assumption, with migration effort halved and a base effort of 2 to 10 person-weeks.</w:t>
+        <w:t xml:space="preserve"> Multiply the expected number of migrations by the effort a vendor-neutral layer would save, and compare it with the cost of building and maintaining the layer and the evaluation harness. In our simulation the break-even is about 15 to 16 person-weeks under the least favorable price assumption, with migration effort halved and a base effort of 2 to 10 person-weeks.</w:t>
       </w:r>
     </w:p>
     <w:p>
@@ -2165,14 +2187,14 @@
           <w:b/>
           <w:i w:val="0"/>
         </w:rPr>
-        <w:t>Use a plain NPV check for early switching.</w:t>
+        <w:t>Switch early only for large, persistent price gaps.</w:t>
       </w:r>
       <w:r>
         <w:rPr>
           <w:b w:val="0"/>
           <w:i w:val="0"/>
         </w:rPr>
-        <w:t xml:space="preserve"> Include the switching cost and the testing effort, and leave out volatility-based thresholds until they are calibrated.</w:t>
+        <w:t xml:space="preserve"> Include the switching cost and the testing effort, and require a margin above the NPV break-even; the gain is small compared with the choice made at retirement.</w:t>
       </w:r>
     </w:p>
     <w:p>
@@ -2216,7 +2238,7 @@
           <w:b w:val="0"/>
           <w:i w:val="0"/>
         </w:rPr>
-        <w:t>Public deprecation records make the rhythm of LLM maintenance measurable: about one retirement a year, usually with months of notice, often with a higher price for the replacement. A real options view turns that rhythm into three decisions: the premium for flexibility, the choice at retirement, and the timing of early moves. In simulation, flexibility pays on migration effort alone when the premium is below about 15 person-weeks, and pays more when vendors' prices move independently. The theoretical timing threshold did not beat a plain NPV rule, which marks where the framework needs better price data before it can claim more.</w:t>
+        <w:t>Public deprecation records make the rhythm of LLM maintenance measurable: about one retirement a year, usually with months of notice, often with a higher price for the replacement. A real options view turns that rhythm into three decisions: the premium for flexibility, the choice at retirement, and the timing of early moves. In simulation, flexibility pays on migration effort alone when the premium is below about 15 to 16 person-weeks, and pays more when vendors' prices move independently. The timing threshold added little (0.4% to 1.5% of cost), so the main value of the options lies at retirement, not in early moves; better price data would sharpen both estimates.</w:t>
       </w:r>
     </w:p>
     <w:p>

</xml_diff>